<commit_message>
academic app all modules completed
</commit_message>
<xml_diff>
--- a/ERP/academic/academic-00-overview.docx
+++ b/ERP/academic/academic-00-overview.docx
@@ -2,7 +2,7 @@
 <file path=word/document.xml><?xml version="1.0" encoding="utf-8"?>
 <w:document xmlns:w="http://schemas.openxmlformats.org/wordprocessingml/2006/main" xmlns:m="http://schemas.openxmlformats.org/officeDocument/2006/math" xmlns:r="http://schemas.openxmlformats.org/officeDocument/2006/relationships" xmlns:o="urn:schemas-microsoft-com:office:office" xmlns:v="urn:schemas-microsoft-com:vml" xmlns:w10="urn:schemas-microsoft-com:office:word" xmlns:a="http://schemas.openxmlformats.org/drawingml/2006/main" xmlns:pic="http://schemas.openxmlformats.org/drawingml/2006/picture" xmlns:wp="http://schemas.openxmlformats.org/drawingml/2006/wordprocessingDrawing">
   <w:body>
-    <w:bookmarkStart w:id="25" w:name="academic-module-api-documentation"/>
+    <w:bookmarkStart w:id="26" w:name="academic-module-api-documentation"/>
     <w:p>
       <w:pPr>
         <w:pStyle w:val="Heading1"/>
@@ -808,13 +808,13 @@
       </w:r>
     </w:p>
     <w:bookmarkEnd w:id="22"/>
-    <w:bookmarkStart w:id="23" w:name="known-cross-cutting-issues"/>
+    <w:bookmarkStart w:id="23" w:name="Xdd40cb701149df3acd5acf7f4045a48fcf10885"/>
     <w:p>
       <w:pPr>
         <w:pStyle w:val="Heading2"/>
       </w:pPr>
       <w:r>
-        <w:t xml:space="preserve">Known cross-cutting issues</w:t>
+        <w:t xml:space="preserve">Highest-priority findings across all 16 files</w:t>
       </w:r>
     </w:p>
     <w:p>
@@ -822,25 +822,19 @@
         <w:pStyle w:val="FirstParagraph"/>
       </w:pPr>
       <w:r>
-        <w:t xml:space="preserve">A few bugs/inconsistencies recur across multiple source files rather</w:t>
-      </w:r>
-      <w:r>
-        <w:t xml:space="preserve"> </w:t>
-      </w:r>
-      <w:r>
-        <w:t xml:space="preserve">than being specific to one endpoint. Noted here once, referenced from</w:t>
-      </w:r>
-      <w:r>
-        <w:t xml:space="preserve"> </w:t>
-      </w:r>
-      <w:r>
-        <w:t xml:space="preserve">the individual docs where they apply, so they’re only explained in full</w:t>
-      </w:r>
-      <w:r>
-        <w:t xml:space="preserve"> </w:t>
-      </w:r>
-      <w:r>
-        <w:t xml:space="preserve">in one place.</w:t>
+        <w:t xml:space="preserve">Everything below is detailed in its own doc; this is a triage list if</w:t>
+      </w:r>
+      <w:r>
+        <w:t xml:space="preserve"> </w:t>
+      </w:r>
+      <w:r>
+        <w:t xml:space="preserve">you want to fix things in order of real-world impact rather than</w:t>
+      </w:r>
+      <w:r>
+        <w:t xml:space="preserve"> </w:t>
+      </w:r>
+      <w:r>
+        <w:t xml:space="preserve">reading all 16 files front to back.</w:t>
       </w:r>
     </w:p>
     <w:p>
@@ -857,161 +851,20 @@
           <w:bCs/>
           <w:b/>
         </w:rPr>
-        <w:t xml:space="preserve">logger.error(exc_info=True)</w:t>
-      </w:r>
-      <w:r>
-        <w:rPr>
-          <w:bCs/>
-          <w:b/>
-        </w:rPr>
-        <w:t xml:space="preserve"> </w:t>
-      </w:r>
-      <w:r>
-        <w:rPr>
-          <w:bCs/>
-          <w:b/>
-        </w:rPr>
-        <w:t xml:space="preserve">called with no</w:t>
-      </w:r>
-      <w:r>
-        <w:rPr>
-          <w:bCs/>
-          <w:b/>
-        </w:rPr>
-        <w:t xml:space="preserve"> </w:t>
-      </w:r>
-      <w:r>
-        <w:rPr>
-          <w:rStyle w:val="VerbatimChar"/>
-          <w:bCs/>
-          <w:b/>
-        </w:rPr>
-        <w:t xml:space="preserve">msg</w:t>
-      </w:r>
-      <w:r>
-        <w:rPr>
-          <w:bCs/>
-          <w:b/>
-        </w:rPr>
-        <w:t xml:space="preserve"> </w:t>
-      </w:r>
-      <w:r>
-        <w:rPr>
-          <w:bCs/>
-          <w:b/>
-        </w:rPr>
-        <w:t xml:space="preserve">argument.</w:t>
-      </w:r>
-      <w:r>
-        <w:t xml:space="preserve"> </w:t>
-      </w:r>
-      <w:r>
-        <w:t xml:space="preserve">Python’s</w:t>
-      </w:r>
-      <w:r>
-        <w:t xml:space="preserve"> </w:t>
-      </w:r>
-      <w:r>
-        <w:rPr>
-          <w:rStyle w:val="VerbatimChar"/>
-        </w:rPr>
-        <w:t xml:space="preserve">Logger.error(msg, *args, **kwargs)</w:t>
-      </w:r>
-      <w:r>
-        <w:t xml:space="preserve"> </w:t>
-      </w:r>
-      <w:r>
-        <w:t xml:space="preserve">requires</w:t>
-      </w:r>
-      <w:r>
-        <w:t xml:space="preserve"> </w:t>
-      </w:r>
-      <w:r>
-        <w:rPr>
-          <w:rStyle w:val="VerbatimChar"/>
-        </w:rPr>
-        <w:t xml:space="preserve">msg</w:t>
-      </w:r>
-      <w:r>
-        <w:t xml:space="preserve">; calling</w:t>
-      </w:r>
-      <w:r>
-        <w:t xml:space="preserve"> </w:t>
-      </w:r>
-      <w:r>
-        <w:t xml:space="preserve">it with only</w:t>
-      </w:r>
-      <w:r>
-        <w:t xml:space="preserve"> </w:t>
-      </w:r>
-      <w:r>
-        <w:rPr>
-          <w:rStyle w:val="VerbatimChar"/>
-        </w:rPr>
-        <w:t xml:space="preserve">exc_info=True</w:t>
-      </w:r>
-      <w:r>
-        <w:t xml:space="preserve"> </w:t>
-      </w:r>
-      <w:r>
-        <w:t xml:space="preserve">raises</w:t>
-      </w:r>
-      <w:r>
-        <w:t xml:space="preserve"> </w:t>
-      </w:r>
-      <w:r>
-        <w:rPr>
-          <w:rStyle w:val="VerbatimChar"/>
-        </w:rPr>
-        <w:t xml:space="preserve">TypeError</w:t>
-      </w:r>
-      <w:r>
-        <w:t xml:space="preserve"> </w:t>
-      </w:r>
-      <w:r>
-        <w:t xml:space="preserve">on its own, before the</w:t>
-      </w:r>
-      <w:r>
-        <w:t xml:space="preserve"> </w:t>
-      </w:r>
-      <w:r>
-        <w:rPr>
-          <w:rStyle w:val="VerbatimChar"/>
-        </w:rPr>
-        <w:t xml:space="preserve">return format_response(...)</w:t>
-      </w:r>
-      <w:r>
-        <w:t xml:space="preserve"> </w:t>
-      </w:r>
-      <w:r>
-        <w:t xml:space="preserve">line after it ever runs. This pattern</w:t>
-      </w:r>
-      <w:r>
-        <w:t xml:space="preserve"> </w:t>
-      </w:r>
-      <w:r>
-        <w:t xml:space="preserve">appears in most</w:t>
-      </w:r>
-      <w:r>
-        <w:t xml:space="preserve"> </w:t>
-      </w:r>
-      <w:r>
-        <w:rPr>
-          <w:rStyle w:val="VerbatimChar"/>
-        </w:rPr>
-        <w:t xml:space="preserve">except SomeModel.DoesNotExist:</w:t>
-      </w:r>
-      <w:r>
-        <w:t xml:space="preserve"> </w:t>
-      </w:r>
-      <w:r>
-        <w:t xml:space="preserve">branches across the</w:t>
-      </w:r>
-      <w:r>
-        <w:t xml:space="preserve"> </w:t>
-      </w:r>
-      <w:r>
-        <w:t xml:space="preserve">app, which means most of the documented</w:t>
+        <w:t xml:space="preserve">staff-list-management.md</w:t>
+      </w:r>
+      <w:r>
+        <w:rPr>
+          <w:bCs/>
+          <w:b/>
+        </w:rPr>
+        <w:t xml:space="preserve">, endpoints 6/7/9</w:t>
+      </w:r>
+      <w:r>
+        <w:t xml:space="preserve"> </w:t>
+      </w:r>
+      <w:r>
+        <w:t xml:space="preserve">— three</w:t>
       </w:r>
       <w:r>
         <w:t xml:space="preserve"> </w:t>
@@ -1020,7 +873,7 @@
         <w:t xml:space="preserve">“</w:t>
       </w:r>
       <w:r>
-        <w:t xml:space="preserve">not found (404)</w:t>
+        <w:t xml:space="preserve">password reset</w:t>
       </w:r>
       <w:r>
         <w:t xml:space="preserve">”</w:t>
@@ -1029,140 +882,25 @@
         <w:t xml:space="preserve"> </w:t>
       </w:r>
       <w:r>
-        <w:t xml:space="preserve">responses</w:t>
-      </w:r>
-      <w:r>
-        <w:t xml:space="preserve"> </w:t>
-      </w:r>
-      <w:r>
-        <w:t xml:space="preserve">in the affected files are not actually what a caller receives —</w:t>
-      </w:r>
-      <w:r>
-        <w:t xml:space="preserve"> </w:t>
-      </w:r>
-      <w:r>
-        <w:t xml:space="preserve">they get an unhandled server error instead. Confirmed present in:</w:t>
-      </w:r>
-      <w:r>
-        <w:t xml:space="preserve"> </w:t>
-      </w:r>
-      <w:r>
-        <w:rPr>
-          <w:rStyle w:val="VerbatimChar"/>
-        </w:rPr>
-        <w:t xml:space="preserve">univ_dept.py</w:t>
-      </w:r>
-      <w:r>
-        <w:t xml:space="preserve">,</w:t>
-      </w:r>
-      <w:r>
-        <w:t xml:space="preserve"> </w:t>
-      </w:r>
-      <w:r>
-        <w:rPr>
-          <w:rStyle w:val="VerbatimChar"/>
-        </w:rPr>
-        <w:t xml:space="preserve">univ_faculty.py</w:t>
-      </w:r>
-      <w:r>
-        <w:t xml:space="preserve">,</w:t>
-      </w:r>
-      <w:r>
-        <w:t xml:space="preserve"> </w:t>
-      </w:r>
-      <w:r>
-        <w:rPr>
-          <w:rStyle w:val="VerbatimChar"/>
-        </w:rPr>
-        <w:t xml:space="preserve">univ_school.py</w:t>
-      </w:r>
-      <w:r>
-        <w:t xml:space="preserve">,</w:t>
-      </w:r>
-      <w:r>
-        <w:t xml:space="preserve"> </w:t>
-      </w:r>
-      <w:r>
-        <w:rPr>
-          <w:rStyle w:val="VerbatimChar"/>
-        </w:rPr>
-        <w:t xml:space="preserve">course.py</w:t>
-      </w:r>
-      <w:r>
-        <w:t xml:space="preserve"> </w:t>
-      </w:r>
-      <w:r>
-        <w:t xml:space="preserve">(specifically</w:t>
-      </w:r>
-      <w:r>
-        <w:t xml:space="preserve"> </w:t>
-      </w:r>
-      <w:r>
-        <w:rPr>
-          <w:rStyle w:val="VerbatimChar"/>
-        </w:rPr>
-        <w:t xml:space="preserve">CourseMasterUpdateAPI</w:t>
-      </w:r>
-      <w:r>
-        <w:t xml:space="preserve"> </w:t>
-      </w:r>
-      <w:r>
-        <w:t xml:space="preserve">and</w:t>
-      </w:r>
-      <w:r>
-        <w:t xml:space="preserve"> </w:t>
-      </w:r>
-      <w:r>
-        <w:rPr>
-          <w:rStyle w:val="VerbatimChar"/>
-        </w:rPr>
-        <w:t xml:space="preserve">CourseMasterStatusAPI</w:t>
-      </w:r>
-      <w:r>
-        <w:t xml:space="preserve">).</w:t>
-      </w:r>
-      <w:r>
-        <w:t xml:space="preserve"> </w:t>
-      </w:r>
-      <w:r>
-        <w:t xml:space="preserve">Confirmed</w:t>
-      </w:r>
-      <w:r>
-        <w:t xml:space="preserve"> </w:t>
-      </w:r>
-      <w:r>
-        <w:rPr>
-          <w:bCs/>
-          <w:b/>
-        </w:rPr>
-        <w:t xml:space="preserve">absent</w:t>
-      </w:r>
-      <w:r>
-        <w:t xml:space="preserve"> </w:t>
-      </w:r>
-      <w:r>
-        <w:t xml:space="preserve">from</w:t>
-      </w:r>
-      <w:r>
-        <w:t xml:space="preserve"> </w:t>
-      </w:r>
-      <w:r>
-        <w:rPr>
-          <w:rStyle w:val="VerbatimChar"/>
-        </w:rPr>
-        <w:t xml:space="preserve">univ_programmes.py</w:t>
-      </w:r>
-      <w:r>
-        <w:t xml:space="preserve"> </w:t>
-      </w:r>
-      <w:r>
-        <w:t xml:space="preserve">(that file doesn’t use</w:t>
-      </w:r>
-      <w:r>
-        <w:t xml:space="preserve"> </w:t>
-      </w:r>
-      <w:r>
-        <w:t xml:space="preserve">this except-clause pattern at all).</w:t>
+        <w:t xml:space="preserve">endpoints copy a hardcoded reference user’s</w:t>
+      </w:r>
+      <w:r>
+        <w:t xml:space="preserve"> </w:t>
+      </w:r>
+      <w:r>
+        <w:t xml:space="preserve">password hash onto the target account instead of generating a new</w:t>
+      </w:r>
+      <w:r>
+        <w:t xml:space="preserve"> </w:t>
+      </w:r>
+      <w:r>
+        <w:t xml:space="preserve">one, with no check that the caller has authority over the account</w:t>
+      </w:r>
+      <w:r>
+        <w:t xml:space="preserve"> </w:t>
+      </w:r>
+      <w:r>
+        <w:t xml:space="preserve">being reset.</w:t>
       </w:r>
     </w:p>
     <w:p>
@@ -1179,144 +917,50 @@
           <w:bCs/>
           <w:b/>
         </w:rPr>
-        <w:t xml:space="preserve">logger.error(err, exc_info=True)</w:t>
-      </w:r>
-      <w:r>
-        <w:rPr>
-          <w:bCs/>
-          <w:b/>
-        </w:rPr>
-        <w:t xml:space="preserve"> </w:t>
-      </w:r>
-      <w:r>
-        <w:rPr>
-          <w:bCs/>
-          <w:b/>
-        </w:rPr>
-        <w:t xml:space="preserve">referencing an undefined</w:t>
-      </w:r>
-      <w:r>
-        <w:rPr>
-          <w:bCs/>
-          <w:b/>
-        </w:rPr>
-        <w:t xml:space="preserve"> </w:t>
-      </w:r>
-      <w:r>
-        <w:rPr>
-          <w:rStyle w:val="VerbatimChar"/>
-          <w:bCs/>
-          <w:b/>
-        </w:rPr>
-        <w:t xml:space="preserve">err</w:t>
-      </w:r>
-      <w:r>
-        <w:t xml:space="preserve"> </w:t>
-      </w:r>
-      <w:r>
-        <w:t xml:space="preserve">inside an</w:t>
-      </w:r>
-      <w:r>
-        <w:t xml:space="preserve"> </w:t>
-      </w:r>
-      <w:r>
-        <w:rPr>
-          <w:rStyle w:val="VerbatimChar"/>
-        </w:rPr>
-        <w:t xml:space="preserve">except Exception as e:</w:t>
-      </w:r>
-      <w:r>
-        <w:t xml:space="preserve"> </w:t>
-      </w:r>
-      <w:r>
-        <w:t xml:space="preserve">block (only</w:t>
-      </w:r>
-      <w:r>
-        <w:t xml:space="preserve"> </w:t>
-      </w:r>
-      <w:r>
-        <w:rPr>
-          <w:rStyle w:val="VerbatimChar"/>
-        </w:rPr>
-        <w:t xml:space="preserve">e</w:t>
-      </w:r>
-      <w:r>
-        <w:t xml:space="preserve"> </w:t>
-      </w:r>
-      <w:r>
-        <w:t xml:space="preserve">is bound, not</w:t>
-      </w:r>
-      <w:r>
-        <w:t xml:space="preserve"> </w:t>
-      </w:r>
-      <w:r>
-        <w:rPr>
-          <w:rStyle w:val="VerbatimChar"/>
-        </w:rPr>
-        <w:t xml:space="preserve">err</w:t>
-      </w:r>
-      <w:r>
-        <w:t xml:space="preserve">) — same effect as above, a</w:t>
-      </w:r>
-      <w:r>
-        <w:t xml:space="preserve"> </w:t>
-      </w:r>
-      <w:r>
-        <w:rPr>
-          <w:rStyle w:val="VerbatimChar"/>
-        </w:rPr>
-        <w:t xml:space="preserve">TypeError</w:t>
-      </w:r>
-      <w:r>
-        <w:t xml:space="preserve"> </w:t>
-      </w:r>
-      <w:r>
-        <w:t xml:space="preserve">instead of the intended</w:t>
-      </w:r>
-      <w:r>
-        <w:t xml:space="preserve"> </w:t>
-      </w:r>
-      <w:r>
-        <w:t xml:space="preserve">graceful response. Confirmed present in</w:t>
-      </w:r>
-      <w:r>
-        <w:t xml:space="preserve"> </w:t>
-      </w:r>
-      <w:r>
-        <w:rPr>
-          <w:rStyle w:val="VerbatimChar"/>
-        </w:rPr>
-        <w:t xml:space="preserve">univ_dept.py</w:t>
-      </w:r>
-      <w:r>
-        <w:t xml:space="preserve">’s</w:t>
-      </w:r>
-      <w:r>
-        <w:t xml:space="preserve"> </w:t>
-      </w:r>
-      <w:r>
-        <w:rPr>
-          <w:rStyle w:val="VerbatimChar"/>
-        </w:rPr>
-        <w:t xml:space="preserve">UniversityDepartment.get</w:t>
-      </w:r>
-      <w:r>
-        <w:t xml:space="preserve">/</w:t>
-      </w:r>
-      <w:r>
-        <w:rPr>
-          <w:rStyle w:val="VerbatimChar"/>
-        </w:rPr>
-        <w:t xml:space="preserve">.post</w:t>
-      </w:r>
-      <w:r>
-        <w:t xml:space="preserve">. Not yet seen elsewhere as of this</w:t>
-      </w:r>
-      <w:r>
-        <w:t xml:space="preserve"> </w:t>
-      </w:r>
-      <w:r>
-        <w:t xml:space="preserve">writing, but worth checking for in files documented later.</w:t>
+        <w:t xml:space="preserve">re-admission.md</w:t>
+      </w:r>
+      <w:r>
+        <w:rPr>
+          <w:bCs/>
+          <w:b/>
+        </w:rPr>
+        <w:t xml:space="preserve">, endpoints 7–13</w:t>
+      </w:r>
+      <w:r>
+        <w:t xml:space="preserve"> </w:t>
+      </w:r>
+      <w:r>
+        <w:t xml:space="preserve">— 7 of 13 endpoints swallow</w:t>
+      </w:r>
+      <w:r>
+        <w:t xml:space="preserve"> </w:t>
+      </w:r>
+      <w:r>
+        <w:t xml:space="preserve">exceptions and always report</w:t>
+      </w:r>
+      <w:r>
+        <w:t xml:space="preserve"> </w:t>
+      </w:r>
+      <w:r>
+        <w:rPr>
+          <w:rStyle w:val="VerbatimChar"/>
+        </w:rPr>
+        <w:t xml:space="preserve">status: true</w:t>
+      </w:r>
+      <w:r>
+        <w:t xml:space="preserve">; endpoint 13</w:t>
+      </w:r>
+      <w:r>
+        <w:t xml:space="preserve"> </w:t>
+      </w:r>
+      <w:r>
+        <w:t xml:space="preserve">(CA mark entry) can silently fail to save marks with no error</w:t>
+      </w:r>
+      <w:r>
+        <w:t xml:space="preserve"> </w:t>
+      </w:r>
+      <w:r>
+        <w:t xml:space="preserve">surfaced to the caller.</w:t>
       </w:r>
     </w:p>
     <w:p>
@@ -1333,118 +977,1096 @@
           <w:bCs/>
           <w:b/>
         </w:rPr>
-        <w:t xml:space="preserve">..._SUCcESS_MSG</w:t>
-      </w:r>
-      <w:r>
-        <w:rPr>
-          <w:bCs/>
-          <w:b/>
-        </w:rPr>
-        <w:t xml:space="preserve"> </w:t>
-      </w:r>
-      <w:r>
-        <w:rPr>
-          <w:bCs/>
-          <w:b/>
-        </w:rPr>
-        <w:t xml:space="preserve">typo (lowercase</w:t>
-      </w:r>
-      <w:r>
-        <w:rPr>
-          <w:bCs/>
-          <w:b/>
-        </w:rPr>
-        <w:t xml:space="preserve"> </w:t>
-      </w:r>
-      <w:r>
-        <w:rPr>
-          <w:bCs/>
-          <w:b/>
-        </w:rPr>
+        <w:t xml:space="preserve">dcb.py</w:t>
+      </w:r>
+      <w:r>
+        <w:rPr>
+          <w:bCs/>
+          <w:b/>
+        </w:rPr>
+        <w:t xml:space="preserve">’s</w:t>
+      </w:r>
+      <w:r>
+        <w:rPr>
+          <w:bCs/>
+          <w:b/>
+        </w:rPr>
+        <w:t xml:space="preserve"> </w:t>
+      </w:r>
+      <w:r>
+        <w:rPr>
+          <w:rStyle w:val="VerbatimChar"/>
+          <w:bCs/>
+          <w:b/>
+        </w:rPr>
+        <w:t xml:space="preserve">BulkOpTicket</w:t>
+      </w:r>
+      <w:r>
+        <w:t xml:space="preserve"> </w:t>
+      </w:r>
+      <w:r>
+        <w:t xml:space="preserve">(</w:t>
+      </w:r>
+      <w:r>
+        <w:rPr>
+          <w:rStyle w:val="VerbatimChar"/>
+        </w:rPr>
+        <w:t xml:space="preserve">demand-cost-bill.md</w:t>
+      </w:r>
+      <w:r>
+        <w:t xml:space="preserve">, endpoint 3)</w:t>
+      </w:r>
+      <w:r>
+        <w:t xml:space="preserve"> </w:t>
+      </w:r>
+      <w:r>
+        <w:t xml:space="preserve">— cannot currently succeed at all (</w:t>
+      </w:r>
+      <w:r>
+        <w:rPr>
+          <w:rStyle w:val="VerbatimChar"/>
+        </w:rPr>
+        <w:t xml:space="preserve">.filter(...).id</w:t>
+      </w:r>
+      <w:r>
+        <w:t xml:space="preserve"> </w:t>
+      </w:r>
+      <w:r>
+        <w:t xml:space="preserve">with no</w:t>
+      </w:r>
+      <w:r>
+        <w:t xml:space="preserve"> </w:t>
+      </w:r>
+      <w:r>
+        <w:rPr>
+          <w:rStyle w:val="VerbatimChar"/>
+        </w:rPr>
+        <w:t xml:space="preserve">.first()</w:t>
+      </w:r>
+      <w:r>
+        <w:t xml:space="preserve">/</w:t>
+      </w:r>
+      <w:r>
+        <w:rPr>
+          <w:rStyle w:val="VerbatimChar"/>
+        </w:rPr>
+        <w:t xml:space="preserve">.get()</w:t>
+      </w:r>
+      <w:r>
+        <w:t xml:space="preserve">).</w:t>
+      </w:r>
+    </w:p>
+    <w:p>
+      <w:pPr>
+        <w:numPr>
+          <w:ilvl w:val="0"/>
+          <w:numId w:val="1002"/>
+        </w:numPr>
+        <w:pStyle w:val="Compact"/>
+      </w:pPr>
+      <w:r>
+        <w:rPr>
+          <w:rStyle w:val="VerbatimChar"/>
+          <w:bCs/>
+          <w:b/>
+        </w:rPr>
+        <w:t xml:space="preserve">course_mark_conig.py</w:t>
+      </w:r>
+      <w:r>
+        <w:rPr>
+          <w:bCs/>
+          <w:b/>
+        </w:rPr>
+        <w:t xml:space="preserve">’s two filter helpers</w:t>
+      </w:r>
+      <w:r>
+        <w:t xml:space="preserve"> </w:t>
+      </w:r>
+      <w:r>
+        <w:t xml:space="preserve">(</w:t>
+      </w:r>
+      <w:r>
+        <w:rPr>
+          <w:rStyle w:val="VerbatimChar"/>
+        </w:rPr>
+        <w:t xml:space="preserve">course-mark-configuration.md</w:t>
+      </w:r>
+      <w:r>
+        <w:t xml:space="preserve">) — both docstrings describe the</w:t>
+      </w:r>
+      <w:r>
+        <w:t xml:space="preserve"> </w:t>
+      </w:r>
+      <w:r>
+        <w:t xml:space="preserve">opposite of what the code does.</w:t>
+      </w:r>
+    </w:p>
+    <w:p>
+      <w:pPr>
+        <w:numPr>
+          <w:ilvl w:val="0"/>
+          <w:numId w:val="1002"/>
+        </w:numPr>
+        <w:pStyle w:val="Compact"/>
+      </w:pPr>
+      <w:r>
+        <w:rPr>
+          <w:rStyle w:val="VerbatimChar"/>
+          <w:bCs/>
+          <w:b/>
+        </w:rPr>
+        <w:t xml:space="preserve">readmission.py</w:t>
+      </w:r>
+      <w:r>
+        <w:rPr>
+          <w:bCs/>
+          <w:b/>
+        </w:rPr>
+        <w:t xml:space="preserve">’s</w:t>
+      </w:r>
+      <w:r>
+        <w:rPr>
+          <w:bCs/>
+          <w:b/>
+        </w:rPr>
+        <w:t xml:space="preserve"> </w:t>
+      </w:r>
+      <w:r>
+        <w:rPr>
+          <w:rStyle w:val="VerbatimChar"/>
+          <w:bCs/>
+          <w:b/>
+        </w:rPr>
+        <w:t xml:space="preserve">ReadmissionPaperExamCancellation</w:t>
+      </w:r>
+      <w:r>
+        <w:t xml:space="preserve"> </w:t>
+      </w:r>
+      <w:r>
+        <w:t xml:space="preserve">(</w:t>
+      </w:r>
+      <w:r>
+        <w:rPr>
+          <w:rStyle w:val="VerbatimChar"/>
+        </w:rPr>
+        <w:t xml:space="preserve">re-admission.md</w:t>
+      </w:r>
+      <w:r>
+        <w:t xml:space="preserve">, endpoint 5) —</w:t>
+      </w:r>
+      <w:r>
+        <w:t xml:space="preserve"> </w:t>
+      </w:r>
+      <w:r>
+        <w:rPr>
+          <w:rStyle w:val="VerbatimChar"/>
+        </w:rPr>
+        <w:t xml:space="preserve">created_on = timezone.now</w:t>
+      </w:r>
+      <w:r>
+        <w:t xml:space="preserve"> </w:t>
+      </w:r>
+      <w:r>
+        <w:t xml:space="preserve">(missing parentheses) plus no</w:t>
+      </w:r>
+      <w:r>
+        <w:t xml:space="preserve"> </w:t>
+      </w:r>
+      <w:r>
+        <w:rPr>
+          <w:rStyle w:val="VerbatimChar"/>
+        </w:rPr>
+        <w:t xml:space="preserve">transaction.atomic()</w:t>
+      </w:r>
+      <w:r>
+        <w:t xml:space="preserve"> </w:t>
+      </w:r>
+      <w:r>
+        <w:t xml:space="preserve">around a</w:t>
+      </w:r>
+      <w:r>
+        <w:t xml:space="preserve"> </w:t>
+      </w:r>
+      <w:r>
+        <w:t xml:space="preserve">cascade touching a dozen-plus tables.</w:t>
+      </w:r>
+    </w:p>
+    <w:p>
+      <w:pPr>
+        <w:numPr>
+          <w:ilvl w:val="0"/>
+          <w:numId w:val="1002"/>
+        </w:numPr>
+        <w:pStyle w:val="Compact"/>
+      </w:pPr>
+      <w:r>
+        <w:rPr>
+          <w:bCs/>
+          <w:b/>
+        </w:rPr>
+        <w:t xml:space="preserve">The</w:t>
+      </w:r>
+      <w:r>
+        <w:rPr>
+          <w:bCs/>
+          <w:b/>
+        </w:rPr>
+        <w:t xml:space="preserve"> </w:t>
+      </w:r>
+      <w:r>
+        <w:rPr>
+          <w:rStyle w:val="VerbatimChar"/>
+          <w:bCs/>
+          <w:b/>
+        </w:rPr>
+        <w:t xml:space="preserve">logger.error(exc_info=True)</w:t>
+      </w:r>
+      <w:r>
+        <w:rPr>
+          <w:bCs/>
+          <w:b/>
+        </w:rPr>
+        <w:t xml:space="preserve"> </w:t>
+      </w:r>
+      <w:r>
+        <w:rPr>
+          <w:bCs/>
+          <w:b/>
+        </w:rPr>
+        <w:t xml:space="preserve">missing-</w:t>
+      </w:r>
+      <w:r>
+        <w:rPr>
+          <w:rStyle w:val="VerbatimChar"/>
+          <w:bCs/>
+          <w:b/>
+        </w:rPr>
+        <w:t xml:space="preserve">msg</w:t>
+      </w:r>
+      <w:r>
+        <w:rPr>
+          <w:bCs/>
+          <w:b/>
+        </w:rPr>
+        <w:t xml:space="preserve"> </w:t>
+      </w:r>
+      <w:r>
+        <w:rPr>
+          <w:bCs/>
+          <w:b/>
+        </w:rPr>
+        <w:t xml:space="preserve">bug</w:t>
+      </w:r>
+      <w:r>
+        <w:t xml:space="preserve"> </w:t>
+      </w:r>
+      <w:r>
+        <w:t xml:space="preserve">— see</w:t>
+      </w:r>
+      <w:r>
+        <w:t xml:space="preserve"> </w:t>
+      </w:r>
+      <w:r>
         <w:t xml:space="preserve">“</w:t>
       </w:r>
       <w:r>
-        <w:rPr>
-          <w:bCs/>
-          <w:b/>
-        </w:rPr>
-        <w:t xml:space="preserve">c</w:t>
-      </w:r>
-      <w:r>
-        <w:rPr>
-          <w:bCs/>
-          <w:b/>
-        </w:rPr>
+        <w:t xml:space="preserve">Known cross-cutting issues</w:t>
+      </w:r>
+      <w:r>
         <w:t xml:space="preserve">”</w:t>
       </w:r>
       <w:r>
-        <w:rPr>
-          <w:bCs/>
-          <w:b/>
-        </w:rPr>
-        <w:t xml:space="preserve">) vs. the correctly-spelled</w:t>
-      </w:r>
-      <w:r>
-        <w:rPr>
-          <w:bCs/>
-          <w:b/>
-        </w:rPr>
-        <w:t xml:space="preserve"> </w:t>
-      </w:r>
-      <w:r>
-        <w:rPr>
-          <w:rStyle w:val="VerbatimChar"/>
-          <w:bCs/>
-          <w:b/>
-        </w:rPr>
-        <w:t xml:space="preserve">..._SUCCESS_MSG</w:t>
-      </w:r>
-      <w:r>
-        <w:rPr>
-          <w:bCs/>
-          <w:b/>
-        </w:rPr>
+        <w:t xml:space="preserve"> </w:t>
+      </w:r>
+      <w:r>
+        <w:t xml:space="preserve">below; breaks most</w:t>
+      </w:r>
+      <w:r>
+        <w:t xml:space="preserve"> </w:t>
+      </w:r>
+      <w:r>
+        <w:rPr>
+          <w:rStyle w:val="VerbatimChar"/>
+        </w:rPr>
+        <w:t xml:space="preserve">DoesNotExist</w:t>
+      </w:r>
+      <w:r>
+        <w:t xml:space="preserve"> </w:t>
+      </w:r>
+      <w:r>
+        <w:t xml:space="preserve">404</w:t>
+      </w:r>
+      <w:r>
+        <w:t xml:space="preserve"> </w:t>
+      </w:r>
+      <w:r>
+        <w:t xml:space="preserve">responses in</w:t>
+      </w:r>
+      <w:r>
+        <w:t xml:space="preserve"> </w:t>
+      </w:r>
+      <w:r>
+        <w:rPr>
+          <w:rStyle w:val="VerbatimChar"/>
+        </w:rPr>
+        <w:t xml:space="preserve">univ_dept.py</w:t>
+      </w:r>
+      <w:r>
+        <w:t xml:space="preserve">,</w:t>
+      </w:r>
+      <w:r>
+        <w:t xml:space="preserve"> </w:t>
+      </w:r>
+      <w:r>
+        <w:rPr>
+          <w:rStyle w:val="VerbatimChar"/>
+        </w:rPr>
+        <w:t xml:space="preserve">univ_faculty.py</w:t>
+      </w:r>
+      <w:r>
+        <w:t xml:space="preserve">,</w:t>
+      </w:r>
+      <w:r>
+        <w:t xml:space="preserve"> </w:t>
+      </w:r>
+      <w:r>
+        <w:rPr>
+          <w:rStyle w:val="VerbatimChar"/>
+        </w:rPr>
+        <w:t xml:space="preserve">univ_school.py</w:t>
+      </w:r>
+      <w:r>
+        <w:t xml:space="preserve">,</w:t>
+      </w:r>
+      <w:r>
+        <w:t xml:space="preserve"> </w:t>
+      </w:r>
+      <w:r>
+        <w:t xml:space="preserve">and</w:t>
+      </w:r>
+      <w:r>
+        <w:t xml:space="preserve"> </w:t>
+      </w:r>
+      <w:r>
+        <w:rPr>
+          <w:rStyle w:val="VerbatimChar"/>
+        </w:rPr>
+        <w:t xml:space="preserve">course.py</w:t>
+      </w:r>
+      <w:r>
         <w:t xml:space="preserve">.</w:t>
       </w:r>
-      <w:r>
-        <w:t xml:space="preserve"> </w:t>
-      </w:r>
-      <w:r>
-        <w:t xml:space="preserve">Both spellings exist as separate constants in</w:t>
-      </w:r>
-      <w:r>
-        <w:t xml:space="preserve"> </w:t>
-      </w:r>
-      <w:r>
-        <w:rPr>
-          <w:rStyle w:val="VerbatimChar"/>
-        </w:rPr>
-        <w:t xml:space="preserve">util/constants.py</w:t>
-      </w:r>
-      <w:r>
-        <w:t xml:space="preserve">, used inconsistently even within a single file.</w:t>
-      </w:r>
-      <w:r>
-        <w:t xml:space="preserve"> </w:t>
-      </w:r>
-      <w:r>
-        <w:t xml:space="preserve">Confirmed in</w:t>
-      </w:r>
-      <w:r>
-        <w:t xml:space="preserve"> </w:t>
-      </w:r>
-      <w:r>
-        <w:rPr>
-          <w:rStyle w:val="VerbatimChar"/>
-        </w:rPr>
-        <w:t xml:space="preserve">course.py</w:t>
-      </w:r>
-      <w:r>
-        <w:t xml:space="preserve">; worth checking for elsewhere.</w:t>
+    </w:p>
+    <w:p>
+      <w:pPr>
+        <w:numPr>
+          <w:ilvl w:val="0"/>
+          <w:numId w:val="1002"/>
+        </w:numPr>
+        <w:pStyle w:val="Compact"/>
+      </w:pPr>
+      <w:r>
+        <w:rPr>
+          <w:rStyle w:val="VerbatimChar"/>
+          <w:bCs/>
+          <w:b/>
+        </w:rPr>
+        <w:t xml:space="preserve">certificate.py</w:t>
+      </w:r>
+      <w:r>
+        <w:rPr>
+          <w:bCs/>
+          <w:b/>
+        </w:rPr>
+        <w:t xml:space="preserve">’s</w:t>
+      </w:r>
+      <w:r>
+        <w:rPr>
+          <w:bCs/>
+          <w:b/>
+        </w:rPr>
+        <w:t xml:space="preserve"> </w:t>
+      </w:r>
+      <w:r>
+        <w:rPr>
+          <w:rStyle w:val="VerbatimChar"/>
+          <w:bCs/>
+          <w:b/>
+        </w:rPr>
+        <w:t xml:space="preserve">GeneralPurposeCertificate</w:t>
+      </w:r>
+      <w:r>
+        <w:t xml:space="preserve"> </w:t>
+      </w:r>
+      <w:r>
+        <w:t xml:space="preserve">(</w:t>
+      </w:r>
+      <w:r>
+        <w:rPr>
+          <w:rStyle w:val="VerbatimChar"/>
+        </w:rPr>
+        <w:t xml:space="preserve">general-purpose-certificate.md</w:t>
+      </w:r>
+      <w:r>
+        <w:t xml:space="preserve">, endpoint 1) — returns every</w:t>
+      </w:r>
+      <w:r>
+        <w:t xml:space="preserve"> </w:t>
+      </w:r>
+      <w:r>
+        <w:t xml:space="preserve">student’s service requests to any logged-in caller; the per-user</w:t>
+      </w:r>
+      <w:r>
+        <w:t xml:space="preserve"> </w:t>
+      </w:r>
+      <w:r>
+        <w:t xml:space="preserve">filter looks like it was disabled, not never-written (the code is</w:t>
+      </w:r>
+      <w:r>
+        <w:t xml:space="preserve"> </w:t>
+      </w:r>
+      <w:r>
+        <w:t xml:space="preserve">still there, commented out).</w:t>
       </w:r>
     </w:p>
     <w:bookmarkEnd w:id="23"/>
-    <w:bookmarkStart w:id="24" w:name="Xb6168f56817381df0dd5806bfe14767e696e242"/>
+    <w:bookmarkStart w:id="24" w:name="known-cross-cutting-issues"/>
+    <w:p>
+      <w:pPr>
+        <w:pStyle w:val="Heading2"/>
+      </w:pPr>
+      <w:r>
+        <w:t xml:space="preserve">Known cross-cutting issues</w:t>
+      </w:r>
+    </w:p>
+    <w:p>
+      <w:pPr>
+        <w:pStyle w:val="FirstParagraph"/>
+      </w:pPr>
+      <w:r>
+        <w:t xml:space="preserve">A few bugs/inconsistencies recur across multiple source files rather</w:t>
+      </w:r>
+      <w:r>
+        <w:t xml:space="preserve"> </w:t>
+      </w:r>
+      <w:r>
+        <w:t xml:space="preserve">than being specific to one endpoint. Noted here once, referenced from</w:t>
+      </w:r>
+      <w:r>
+        <w:t xml:space="preserve"> </w:t>
+      </w:r>
+      <w:r>
+        <w:t xml:space="preserve">the individual docs where they apply, so they’re only explained in full</w:t>
+      </w:r>
+      <w:r>
+        <w:t xml:space="preserve"> </w:t>
+      </w:r>
+      <w:r>
+        <w:t xml:space="preserve">in one place.</w:t>
+      </w:r>
+    </w:p>
+    <w:p>
+      <w:pPr>
+        <w:numPr>
+          <w:ilvl w:val="0"/>
+          <w:numId w:val="1003"/>
+        </w:numPr>
+        <w:pStyle w:val="Compact"/>
+      </w:pPr>
+      <w:r>
+        <w:rPr>
+          <w:rStyle w:val="VerbatimChar"/>
+          <w:bCs/>
+          <w:b/>
+        </w:rPr>
+        <w:t xml:space="preserve">logger.error(exc_info=True)</w:t>
+      </w:r>
+      <w:r>
+        <w:rPr>
+          <w:bCs/>
+          <w:b/>
+        </w:rPr>
+        <w:t xml:space="preserve"> </w:t>
+      </w:r>
+      <w:r>
+        <w:rPr>
+          <w:bCs/>
+          <w:b/>
+        </w:rPr>
+        <w:t xml:space="preserve">called with no</w:t>
+      </w:r>
+      <w:r>
+        <w:rPr>
+          <w:bCs/>
+          <w:b/>
+        </w:rPr>
+        <w:t xml:space="preserve"> </w:t>
+      </w:r>
+      <w:r>
+        <w:rPr>
+          <w:rStyle w:val="VerbatimChar"/>
+          <w:bCs/>
+          <w:b/>
+        </w:rPr>
+        <w:t xml:space="preserve">msg</w:t>
+      </w:r>
+      <w:r>
+        <w:rPr>
+          <w:bCs/>
+          <w:b/>
+        </w:rPr>
+        <w:t xml:space="preserve"> </w:t>
+      </w:r>
+      <w:r>
+        <w:rPr>
+          <w:bCs/>
+          <w:b/>
+        </w:rPr>
+        <w:t xml:space="preserve">argument.</w:t>
+      </w:r>
+      <w:r>
+        <w:t xml:space="preserve"> </w:t>
+      </w:r>
+      <w:r>
+        <w:t xml:space="preserve">Python’s</w:t>
+      </w:r>
+      <w:r>
+        <w:t xml:space="preserve"> </w:t>
+      </w:r>
+      <w:r>
+        <w:rPr>
+          <w:rStyle w:val="VerbatimChar"/>
+        </w:rPr>
+        <w:t xml:space="preserve">Logger.error(msg, *args, **kwargs)</w:t>
+      </w:r>
+      <w:r>
+        <w:t xml:space="preserve"> </w:t>
+      </w:r>
+      <w:r>
+        <w:t xml:space="preserve">requires</w:t>
+      </w:r>
+      <w:r>
+        <w:t xml:space="preserve"> </w:t>
+      </w:r>
+      <w:r>
+        <w:rPr>
+          <w:rStyle w:val="VerbatimChar"/>
+        </w:rPr>
+        <w:t xml:space="preserve">msg</w:t>
+      </w:r>
+      <w:r>
+        <w:t xml:space="preserve">; calling</w:t>
+      </w:r>
+      <w:r>
+        <w:t xml:space="preserve"> </w:t>
+      </w:r>
+      <w:r>
+        <w:t xml:space="preserve">it with only</w:t>
+      </w:r>
+      <w:r>
+        <w:t xml:space="preserve"> </w:t>
+      </w:r>
+      <w:r>
+        <w:rPr>
+          <w:rStyle w:val="VerbatimChar"/>
+        </w:rPr>
+        <w:t xml:space="preserve">exc_info=True</w:t>
+      </w:r>
+      <w:r>
+        <w:t xml:space="preserve"> </w:t>
+      </w:r>
+      <w:r>
+        <w:t xml:space="preserve">raises</w:t>
+      </w:r>
+      <w:r>
+        <w:t xml:space="preserve"> </w:t>
+      </w:r>
+      <w:r>
+        <w:rPr>
+          <w:rStyle w:val="VerbatimChar"/>
+        </w:rPr>
+        <w:t xml:space="preserve">TypeError</w:t>
+      </w:r>
+      <w:r>
+        <w:t xml:space="preserve"> </w:t>
+      </w:r>
+      <w:r>
+        <w:t xml:space="preserve">on its own, before the</w:t>
+      </w:r>
+      <w:r>
+        <w:t xml:space="preserve"> </w:t>
+      </w:r>
+      <w:r>
+        <w:rPr>
+          <w:rStyle w:val="VerbatimChar"/>
+        </w:rPr>
+        <w:t xml:space="preserve">return format_response(...)</w:t>
+      </w:r>
+      <w:r>
+        <w:t xml:space="preserve"> </w:t>
+      </w:r>
+      <w:r>
+        <w:t xml:space="preserve">line after it ever runs. This pattern</w:t>
+      </w:r>
+      <w:r>
+        <w:t xml:space="preserve"> </w:t>
+      </w:r>
+      <w:r>
+        <w:t xml:space="preserve">appears in most</w:t>
+      </w:r>
+      <w:r>
+        <w:t xml:space="preserve"> </w:t>
+      </w:r>
+      <w:r>
+        <w:rPr>
+          <w:rStyle w:val="VerbatimChar"/>
+        </w:rPr>
+        <w:t xml:space="preserve">except SomeModel.DoesNotExist:</w:t>
+      </w:r>
+      <w:r>
+        <w:t xml:space="preserve"> </w:t>
+      </w:r>
+      <w:r>
+        <w:t xml:space="preserve">branches across the</w:t>
+      </w:r>
+      <w:r>
+        <w:t xml:space="preserve"> </w:t>
+      </w:r>
+      <w:r>
+        <w:t xml:space="preserve">app, which means most of the documented</w:t>
+      </w:r>
+      <w:r>
+        <w:t xml:space="preserve"> </w:t>
+      </w:r>
+      <w:r>
+        <w:t xml:space="preserve">“</w:t>
+      </w:r>
+      <w:r>
+        <w:t xml:space="preserve">not found (404)</w:t>
+      </w:r>
+      <w:r>
+        <w:t xml:space="preserve">”</w:t>
+      </w:r>
+      <w:r>
+        <w:t xml:space="preserve"> </w:t>
+      </w:r>
+      <w:r>
+        <w:t xml:space="preserve">responses</w:t>
+      </w:r>
+      <w:r>
+        <w:t xml:space="preserve"> </w:t>
+      </w:r>
+      <w:r>
+        <w:t xml:space="preserve">in the affected files are not actually what a caller receives —</w:t>
+      </w:r>
+      <w:r>
+        <w:t xml:space="preserve"> </w:t>
+      </w:r>
+      <w:r>
+        <w:t xml:space="preserve">they get an unhandled server error instead. Confirmed present in:</w:t>
+      </w:r>
+      <w:r>
+        <w:t xml:space="preserve"> </w:t>
+      </w:r>
+      <w:r>
+        <w:rPr>
+          <w:rStyle w:val="VerbatimChar"/>
+        </w:rPr>
+        <w:t xml:space="preserve">univ_dept.py</w:t>
+      </w:r>
+      <w:r>
+        <w:t xml:space="preserve">,</w:t>
+      </w:r>
+      <w:r>
+        <w:t xml:space="preserve"> </w:t>
+      </w:r>
+      <w:r>
+        <w:rPr>
+          <w:rStyle w:val="VerbatimChar"/>
+        </w:rPr>
+        <w:t xml:space="preserve">univ_faculty.py</w:t>
+      </w:r>
+      <w:r>
+        <w:t xml:space="preserve">,</w:t>
+      </w:r>
+      <w:r>
+        <w:t xml:space="preserve"> </w:t>
+      </w:r>
+      <w:r>
+        <w:rPr>
+          <w:rStyle w:val="VerbatimChar"/>
+        </w:rPr>
+        <w:t xml:space="preserve">univ_school.py</w:t>
+      </w:r>
+      <w:r>
+        <w:t xml:space="preserve">,</w:t>
+      </w:r>
+      <w:r>
+        <w:t xml:space="preserve"> </w:t>
+      </w:r>
+      <w:r>
+        <w:rPr>
+          <w:rStyle w:val="VerbatimChar"/>
+        </w:rPr>
+        <w:t xml:space="preserve">course.py</w:t>
+      </w:r>
+      <w:r>
+        <w:t xml:space="preserve"> </w:t>
+      </w:r>
+      <w:r>
+        <w:t xml:space="preserve">(specifically</w:t>
+      </w:r>
+      <w:r>
+        <w:t xml:space="preserve"> </w:t>
+      </w:r>
+      <w:r>
+        <w:rPr>
+          <w:rStyle w:val="VerbatimChar"/>
+        </w:rPr>
+        <w:t xml:space="preserve">CourseMasterUpdateAPI</w:t>
+      </w:r>
+      <w:r>
+        <w:t xml:space="preserve"> </w:t>
+      </w:r>
+      <w:r>
+        <w:t xml:space="preserve">and</w:t>
+      </w:r>
+      <w:r>
+        <w:t xml:space="preserve"> </w:t>
+      </w:r>
+      <w:r>
+        <w:rPr>
+          <w:rStyle w:val="VerbatimChar"/>
+        </w:rPr>
+        <w:t xml:space="preserve">CourseMasterStatusAPI</w:t>
+      </w:r>
+      <w:r>
+        <w:t xml:space="preserve">).</w:t>
+      </w:r>
+      <w:r>
+        <w:t xml:space="preserve"> </w:t>
+      </w:r>
+      <w:r>
+        <w:t xml:space="preserve">Confirmed</w:t>
+      </w:r>
+      <w:r>
+        <w:t xml:space="preserve"> </w:t>
+      </w:r>
+      <w:r>
+        <w:rPr>
+          <w:bCs/>
+          <w:b/>
+        </w:rPr>
+        <w:t xml:space="preserve">absent</w:t>
+      </w:r>
+      <w:r>
+        <w:t xml:space="preserve"> </w:t>
+      </w:r>
+      <w:r>
+        <w:t xml:space="preserve">from</w:t>
+      </w:r>
+      <w:r>
+        <w:t xml:space="preserve"> </w:t>
+      </w:r>
+      <w:r>
+        <w:rPr>
+          <w:rStyle w:val="VerbatimChar"/>
+        </w:rPr>
+        <w:t xml:space="preserve">univ_programmes.py</w:t>
+      </w:r>
+      <w:r>
+        <w:t xml:space="preserve"> </w:t>
+      </w:r>
+      <w:r>
+        <w:t xml:space="preserve">(that file doesn’t use</w:t>
+      </w:r>
+      <w:r>
+        <w:t xml:space="preserve"> </w:t>
+      </w:r>
+      <w:r>
+        <w:t xml:space="preserve">this except-clause pattern at all).</w:t>
+      </w:r>
+    </w:p>
+    <w:p>
+      <w:pPr>
+        <w:numPr>
+          <w:ilvl w:val="0"/>
+          <w:numId w:val="1003"/>
+        </w:numPr>
+        <w:pStyle w:val="Compact"/>
+      </w:pPr>
+      <w:r>
+        <w:rPr>
+          <w:rStyle w:val="VerbatimChar"/>
+          <w:bCs/>
+          <w:b/>
+        </w:rPr>
+        <w:t xml:space="preserve">logger.error(err, exc_info=True)</w:t>
+      </w:r>
+      <w:r>
+        <w:rPr>
+          <w:bCs/>
+          <w:b/>
+        </w:rPr>
+        <w:t xml:space="preserve"> </w:t>
+      </w:r>
+      <w:r>
+        <w:rPr>
+          <w:bCs/>
+          <w:b/>
+        </w:rPr>
+        <w:t xml:space="preserve">referencing an undefined</w:t>
+      </w:r>
+      <w:r>
+        <w:rPr>
+          <w:bCs/>
+          <w:b/>
+        </w:rPr>
+        <w:t xml:space="preserve"> </w:t>
+      </w:r>
+      <w:r>
+        <w:rPr>
+          <w:rStyle w:val="VerbatimChar"/>
+          <w:bCs/>
+          <w:b/>
+        </w:rPr>
+        <w:t xml:space="preserve">err</w:t>
+      </w:r>
+      <w:r>
+        <w:t xml:space="preserve"> </w:t>
+      </w:r>
+      <w:r>
+        <w:t xml:space="preserve">inside an</w:t>
+      </w:r>
+      <w:r>
+        <w:t xml:space="preserve"> </w:t>
+      </w:r>
+      <w:r>
+        <w:rPr>
+          <w:rStyle w:val="VerbatimChar"/>
+        </w:rPr>
+        <w:t xml:space="preserve">except Exception as e:</w:t>
+      </w:r>
+      <w:r>
+        <w:t xml:space="preserve"> </w:t>
+      </w:r>
+      <w:r>
+        <w:t xml:space="preserve">block (only</w:t>
+      </w:r>
+      <w:r>
+        <w:t xml:space="preserve"> </w:t>
+      </w:r>
+      <w:r>
+        <w:rPr>
+          <w:rStyle w:val="VerbatimChar"/>
+        </w:rPr>
+        <w:t xml:space="preserve">e</w:t>
+      </w:r>
+      <w:r>
+        <w:t xml:space="preserve"> </w:t>
+      </w:r>
+      <w:r>
+        <w:t xml:space="preserve">is bound, not</w:t>
+      </w:r>
+      <w:r>
+        <w:t xml:space="preserve"> </w:t>
+      </w:r>
+      <w:r>
+        <w:rPr>
+          <w:rStyle w:val="VerbatimChar"/>
+        </w:rPr>
+        <w:t xml:space="preserve">err</w:t>
+      </w:r>
+      <w:r>
+        <w:t xml:space="preserve">) — same effect as above, a</w:t>
+      </w:r>
+      <w:r>
+        <w:t xml:space="preserve"> </w:t>
+      </w:r>
+      <w:r>
+        <w:rPr>
+          <w:rStyle w:val="VerbatimChar"/>
+        </w:rPr>
+        <w:t xml:space="preserve">TypeError</w:t>
+      </w:r>
+      <w:r>
+        <w:t xml:space="preserve"> </w:t>
+      </w:r>
+      <w:r>
+        <w:t xml:space="preserve">instead of the intended</w:t>
+      </w:r>
+      <w:r>
+        <w:t xml:space="preserve"> </w:t>
+      </w:r>
+      <w:r>
+        <w:t xml:space="preserve">graceful response. Confirmed present in</w:t>
+      </w:r>
+      <w:r>
+        <w:t xml:space="preserve"> </w:t>
+      </w:r>
+      <w:r>
+        <w:rPr>
+          <w:rStyle w:val="VerbatimChar"/>
+        </w:rPr>
+        <w:t xml:space="preserve">univ_dept.py</w:t>
+      </w:r>
+      <w:r>
+        <w:t xml:space="preserve">’s</w:t>
+      </w:r>
+      <w:r>
+        <w:t xml:space="preserve"> </w:t>
+      </w:r>
+      <w:r>
+        <w:rPr>
+          <w:rStyle w:val="VerbatimChar"/>
+        </w:rPr>
+        <w:t xml:space="preserve">UniversityDepartment.get</w:t>
+      </w:r>
+      <w:r>
+        <w:t xml:space="preserve">/</w:t>
+      </w:r>
+      <w:r>
+        <w:rPr>
+          <w:rStyle w:val="VerbatimChar"/>
+        </w:rPr>
+        <w:t xml:space="preserve">.post</w:t>
+      </w:r>
+      <w:r>
+        <w:t xml:space="preserve">. Not yet seen elsewhere as of this</w:t>
+      </w:r>
+      <w:r>
+        <w:t xml:space="preserve"> </w:t>
+      </w:r>
+      <w:r>
+        <w:t xml:space="preserve">writing, but worth checking for in files documented later.</w:t>
+      </w:r>
+    </w:p>
+    <w:p>
+      <w:pPr>
+        <w:numPr>
+          <w:ilvl w:val="0"/>
+          <w:numId w:val="1003"/>
+        </w:numPr>
+        <w:pStyle w:val="Compact"/>
+      </w:pPr>
+      <w:r>
+        <w:rPr>
+          <w:rStyle w:val="VerbatimChar"/>
+          <w:bCs/>
+          <w:b/>
+        </w:rPr>
+        <w:t xml:space="preserve">..._SUCcESS_MSG</w:t>
+      </w:r>
+      <w:r>
+        <w:rPr>
+          <w:bCs/>
+          <w:b/>
+        </w:rPr>
+        <w:t xml:space="preserve"> </w:t>
+      </w:r>
+      <w:r>
+        <w:rPr>
+          <w:bCs/>
+          <w:b/>
+        </w:rPr>
+        <w:t xml:space="preserve">typo (lowercase</w:t>
+      </w:r>
+      <w:r>
+        <w:rPr>
+          <w:bCs/>
+          <w:b/>
+        </w:rPr>
+        <w:t xml:space="preserve"> </w:t>
+      </w:r>
+      <w:r>
+        <w:rPr>
+          <w:bCs/>
+          <w:b/>
+        </w:rPr>
+        <w:t xml:space="preserve">“</w:t>
+      </w:r>
+      <w:r>
+        <w:rPr>
+          <w:bCs/>
+          <w:b/>
+        </w:rPr>
+        <w:t xml:space="preserve">c</w:t>
+      </w:r>
+      <w:r>
+        <w:rPr>
+          <w:bCs/>
+          <w:b/>
+        </w:rPr>
+        <w:t xml:space="preserve">”</w:t>
+      </w:r>
+      <w:r>
+        <w:rPr>
+          <w:bCs/>
+          <w:b/>
+        </w:rPr>
+        <w:t xml:space="preserve">) vs. the correctly-spelled</w:t>
+      </w:r>
+      <w:r>
+        <w:rPr>
+          <w:bCs/>
+          <w:b/>
+        </w:rPr>
+        <w:t xml:space="preserve"> </w:t>
+      </w:r>
+      <w:r>
+        <w:rPr>
+          <w:rStyle w:val="VerbatimChar"/>
+          <w:bCs/>
+          <w:b/>
+        </w:rPr>
+        <w:t xml:space="preserve">..._SUCCESS_MSG</w:t>
+      </w:r>
+      <w:r>
+        <w:rPr>
+          <w:bCs/>
+          <w:b/>
+        </w:rPr>
+        <w:t xml:space="preserve">.</w:t>
+      </w:r>
+      <w:r>
+        <w:t xml:space="preserve"> </w:t>
+      </w:r>
+      <w:r>
+        <w:t xml:space="preserve">Both spellings exist as separate constants in</w:t>
+      </w:r>
+      <w:r>
+        <w:t xml:space="preserve"> </w:t>
+      </w:r>
+      <w:r>
+        <w:rPr>
+          <w:rStyle w:val="VerbatimChar"/>
+        </w:rPr>
+        <w:t xml:space="preserve">util/constants.py</w:t>
+      </w:r>
+      <w:r>
+        <w:t xml:space="preserve">, used inconsistently even within a single file.</w:t>
+      </w:r>
+      <w:r>
+        <w:t xml:space="preserve"> </w:t>
+      </w:r>
+      <w:r>
+        <w:t xml:space="preserve">Confirmed in</w:t>
+      </w:r>
+      <w:r>
+        <w:t xml:space="preserve"> </w:t>
+      </w:r>
+      <w:r>
+        <w:rPr>
+          <w:rStyle w:val="VerbatimChar"/>
+        </w:rPr>
+        <w:t xml:space="preserve">course.py</w:t>
+      </w:r>
+      <w:r>
+        <w:t xml:space="preserve">; worth checking for elsewhere.</w:t>
+      </w:r>
+    </w:p>
+    <w:bookmarkEnd w:id="24"/>
+    <w:bookmarkStart w:id="25" w:name="Xb6168f56817381df0dd5806bfe14767e696e242"/>
     <w:p>
       <w:pPr>
         <w:pStyle w:val="Heading2"/>
@@ -1730,7 +2352,23 @@
               <w:jc w:val="left"/>
             </w:pPr>
             <w:r>
-              <w:t xml:space="preserve">University School master + School-Department mapping — from</w:t>
+              <w:t xml:space="preserve">✅</w:t>
+            </w:r>
+            <w:r>
+              <w:t xml:space="preserve"> </w:t>
+            </w:r>
+            <w:r>
+              <w:rPr>
+                <w:bCs/>
+                <w:b/>
+              </w:rPr>
+              <w:t xml:space="preserve">Complete</w:t>
+            </w:r>
+            <w:r>
+              <w:t xml:space="preserve"> </w:t>
+            </w:r>
+            <w:r>
+              <w:t xml:space="preserve">— all 4 endpoints from</w:t>
             </w:r>
             <w:r>
               <w:t xml:space="preserve"> </w:t>
@@ -1742,14 +2380,7 @@
               <w:t xml:space="preserve">univ_school.py</w:t>
             </w:r>
             <w:r>
-              <w:t xml:space="preserve"> </w:t>
-            </w:r>
-            <w:r>
-              <w:rPr>
-                <w:iCs/>
-                <w:i/>
-              </w:rPr>
-              <w:t xml:space="preserve">(coming next)</w:t>
+              <w:t xml:space="preserve">: School master (list/create, fetch/update/delete) and School-Department mapping (list/create, fetch/update/delete)</w:t>
             </w:r>
           </w:p>
         </w:tc>
@@ -1775,7 +2406,23 @@
               <w:jc w:val="left"/>
             </w:pPr>
             <w:r>
-              <w:t xml:space="preserve">General purpose certificate requests, recognition/student-service submissions, SSR approve/revert — from</w:t>
+              <w:t xml:space="preserve">✅</w:t>
+            </w:r>
+            <w:r>
+              <w:t xml:space="preserve"> </w:t>
+            </w:r>
+            <w:r>
+              <w:rPr>
+                <w:bCs/>
+                <w:b/>
+              </w:rPr>
+              <w:t xml:space="preserve">Complete</w:t>
+            </w:r>
+            <w:r>
+              <w:t xml:space="preserve"> </w:t>
+            </w:r>
+            <w:r>
+              <w:t xml:space="preserve">— all 5 endpoints from</w:t>
             </w:r>
             <w:r>
               <w:t xml:space="preserve"> </w:t>
@@ -1787,14 +2434,7 @@
               <w:t xml:space="preserve">certificate.py</w:t>
             </w:r>
             <w:r>
-              <w:t xml:space="preserve"> </w:t>
-            </w:r>
-            <w:r>
-              <w:rPr>
-                <w:iCs/>
-                <w:i/>
-              </w:rPr>
-              <w:t xml:space="preserve">(coming next)</w:t>
+              <w:t xml:space="preserve">: general-purpose-certificate landing data, recognition submission detail lookup, student-service filter, and Principal approve/revert actions</w:t>
             </w:r>
           </w:p>
         </w:tc>
@@ -1820,7 +2460,23 @@
               <w:jc w:val="left"/>
             </w:pPr>
             <w:r>
-              <w:t xml:space="preserve">Course mark parameter configuration, entry, update and approval, incl. section &amp; project courses — from</w:t>
+              <w:t xml:space="preserve">✅</w:t>
+            </w:r>
+            <w:r>
+              <w:t xml:space="preserve"> </w:t>
+            </w:r>
+            <w:r>
+              <w:rPr>
+                <w:bCs/>
+                <w:b/>
+              </w:rPr>
+              <w:t xml:space="preserve">Complete</w:t>
+            </w:r>
+            <w:r>
+              <w:t xml:space="preserve"> </w:t>
+            </w:r>
+            <w:r>
+              <w:t xml:space="preserve">— all 12 endpoints from</w:t>
             </w:r>
             <w:r>
               <w:t xml:space="preserve"> </w:t>
@@ -1832,14 +2488,7 @@
               <w:t xml:space="preserve">course_mark_conig.py</w:t>
             </w:r>
             <w:r>
-              <w:t xml:space="preserve"> </w:t>
-            </w:r>
-            <w:r>
-              <w:rPr>
-                <w:iCs/>
-                <w:i/>
-              </w:rPr>
-              <w:t xml:space="preserve">(coming next)</w:t>
+              <w:t xml:space="preserve">: staff-scoped programme/course lookups, the parameter entry modal, bulk parameter update, and approval</w:t>
             </w:r>
           </w:p>
         </w:tc>
@@ -1865,7 +2514,23 @@
               <w:jc w:val="left"/>
             </w:pPr>
             <w:r>
-              <w:t xml:space="preserve">Programme–course–scheme–semester mapping and fetch helpers — from</w:t>
+              <w:t xml:space="preserve">✅</w:t>
+            </w:r>
+            <w:r>
+              <w:t xml:space="preserve"> </w:t>
+            </w:r>
+            <w:r>
+              <w:rPr>
+                <w:bCs/>
+                <w:b/>
+              </w:rPr>
+              <w:t xml:space="preserve">Complete</w:t>
+            </w:r>
+            <w:r>
+              <w:t xml:space="preserve"> </w:t>
+            </w:r>
+            <w:r>
+              <w:t xml:space="preserve">— all 6 endpoints from</w:t>
             </w:r>
             <w:r>
               <w:t xml:space="preserve"> </w:t>
@@ -1877,14 +2542,7 @@
               <w:t xml:space="preserve">course_mapping.py</w:t>
             </w:r>
             <w:r>
-              <w:t xml:space="preserve"> </w:t>
-            </w:r>
-            <w:r>
-              <w:rPr>
-                <w:iCs/>
-                <w:i/>
-              </w:rPr>
-              <w:t xml:space="preserve">(coming next)</w:t>
+              <w:t xml:space="preserve">: programme-course mapping fetch/bulk-save, cascading programme/scheme/semester/course fetches, and a scheme-course fetch</w:t>
             </w:r>
           </w:p>
         </w:tc>
@@ -1910,7 +2568,23 @@
               <w:jc w:val="left"/>
             </w:pPr>
             <w:r>
-              <w:t xml:space="preserve">College ↔ Programme mapping, groups, subsection programmes, department status — from</w:t>
+              <w:t xml:space="preserve">✅</w:t>
+            </w:r>
+            <w:r>
+              <w:t xml:space="preserve"> </w:t>
+            </w:r>
+            <w:r>
+              <w:rPr>
+                <w:bCs/>
+                <w:b/>
+              </w:rPr>
+              <w:t xml:space="preserve">Complete</w:t>
+            </w:r>
+            <w:r>
+              <w:t xml:space="preserve"> </w:t>
+            </w:r>
+            <w:r>
+              <w:t xml:space="preserve">— all 8 endpoints from</w:t>
             </w:r>
             <w:r>
               <w:t xml:space="preserve"> </w:t>
@@ -1922,14 +2596,7 @@
               <w:t xml:space="preserve">college_programme.py</w:t>
             </w:r>
             <w:r>
-              <w:t xml:space="preserve"> </w:t>
-            </w:r>
-            <w:r>
-              <w:rPr>
-                <w:iCs/>
-                <w:i/>
-              </w:rPr>
-              <w:t xml:space="preserve">(coming next)</w:t>
+              <w:t xml:space="preserve">: seed data, cascading group/class/programme lookups, college search, single-save mapping with duplicate detection, soft-delete, and department status</w:t>
             </w:r>
           </w:p>
         </w:tc>
@@ -1955,7 +2622,23 @@
               <w:jc w:val="left"/>
             </w:pPr>
             <w:r>
-              <w:t xml:space="preserve">College-batch ↔ Programme mapping and bulk upload — from</w:t>
+              <w:t xml:space="preserve">✅</w:t>
+            </w:r>
+            <w:r>
+              <w:t xml:space="preserve"> </w:t>
+            </w:r>
+            <w:r>
+              <w:rPr>
+                <w:bCs/>
+                <w:b/>
+              </w:rPr>
+              <w:t xml:space="preserve">Complete</w:t>
+            </w:r>
+            <w:r>
+              <w:t xml:space="preserve"> </w:t>
+            </w:r>
+            <w:r>
+              <w:t xml:space="preserve">— all 5 endpoints from</w:t>
             </w:r>
             <w:r>
               <w:t xml:space="preserve"> </w:t>
@@ -1967,14 +2650,7 @@
               <w:t xml:space="preserve">collegebatch_programm.py</w:t>
             </w:r>
             <w:r>
-              <w:t xml:space="preserve"> </w:t>
-            </w:r>
-            <w:r>
-              <w:rPr>
-                <w:iCs/>
-                <w:i/>
-              </w:rPr>
-              <w:t xml:space="preserve">(coming next)</w:t>
+              <w:t xml:space="preserve">: seed data, cascading group/programme/college lookups, and bulk batch-upload</w:t>
             </w:r>
           </w:p>
         </w:tc>
@@ -2000,7 +2676,23 @@
               <w:jc w:val="left"/>
             </w:pPr>
             <w:r>
-              <w:t xml:space="preserve">District/college staff lists, Principal add/remove/fetch, password resets — from</w:t>
+              <w:t xml:space="preserve">✅</w:t>
+            </w:r>
+            <w:r>
+              <w:t xml:space="preserve"> </w:t>
+            </w:r>
+            <w:r>
+              <w:rPr>
+                <w:bCs/>
+                <w:b/>
+              </w:rPr>
+              <w:t xml:space="preserve">Complete</w:t>
+            </w:r>
+            <w:r>
+              <w:t xml:space="preserve"> </w:t>
+            </w:r>
+            <w:r>
+              <w:t xml:space="preserve">— all 9 endpoints from</w:t>
             </w:r>
             <w:r>
               <w:t xml:space="preserve"> </w:t>
@@ -2012,14 +2704,23 @@
               <w:t xml:space="preserve">stafflist.py</w:t>
             </w:r>
             <w:r>
+              <w:t xml:space="preserve">: district/college lookups, staff roster, Principal add/remove/fetch, and password resets.</w:t>
+            </w:r>
+            <w:r>
               <w:t xml:space="preserve"> </w:t>
             </w:r>
             <w:r>
               <w:rPr>
-                <w:iCs/>
-                <w:i/>
+                <w:bCs/>
+                <w:b/>
               </w:rPr>
-              <w:t xml:space="preserve">(coming next)</w:t>
+              <w:t xml:space="preserve">Contains this app’s most serious findings so far</w:t>
+            </w:r>
+            <w:r>
+              <w:t xml:space="preserve"> </w:t>
+            </w:r>
+            <w:r>
+              <w:t xml:space="preserve">— see the doc’s opening notes</w:t>
             </w:r>
           </w:p>
         </w:tc>
@@ -2045,7 +2746,23 @@
               <w:jc w:val="left"/>
             </w:pPr>
             <w:r>
-              <w:t xml:space="preserve">External examiner attendance bulk upload screens — from</w:t>
+              <w:t xml:space="preserve">✅</w:t>
+            </w:r>
+            <w:r>
+              <w:t xml:space="preserve"> </w:t>
+            </w:r>
+            <w:r>
+              <w:rPr>
+                <w:bCs/>
+                <w:b/>
+              </w:rPr>
+              <w:t xml:space="preserve">Complete</w:t>
+            </w:r>
+            <w:r>
+              <w:t xml:space="preserve"> </w:t>
+            </w:r>
+            <w:r>
+              <w:t xml:space="preserve">— all 4 endpoints from</w:t>
             </w:r>
             <w:r>
               <w:t xml:space="preserve"> </w:t>
@@ -2057,14 +2774,7 @@
               <w:t xml:space="preserve">attnds_view.py</w:t>
             </w:r>
             <w:r>
-              <w:t xml:space="preserve"> </w:t>
-            </w:r>
-            <w:r>
-              <w:rPr>
-                <w:iCs/>
-                <w:i/>
-              </w:rPr>
-              <w:t xml:space="preserve">(coming next)</w:t>
+              <w:t xml:space="preserve">: district/college lookups, programme list (unusual flat response shape), scheme/semester fetch, and the bulk attendance view (fragile lookup chain — see notes)</w:t>
             </w:r>
           </w:p>
         </w:tc>
@@ -2090,7 +2800,23 @@
               <w:jc w:val="left"/>
             </w:pPr>
             <w:r>
-              <w:t xml:space="preserve">Demand Cost Bill (DCB) generation, OP ticket, bulk OP ticket, DCB printing — from</w:t>
+              <w:t xml:space="preserve">✅</w:t>
+            </w:r>
+            <w:r>
+              <w:t xml:space="preserve"> </w:t>
+            </w:r>
+            <w:r>
+              <w:rPr>
+                <w:bCs/>
+                <w:b/>
+              </w:rPr>
+              <w:t xml:space="preserve">Complete</w:t>
+            </w:r>
+            <w:r>
+              <w:t xml:space="preserve"> </w:t>
+            </w:r>
+            <w:r>
+              <w:t xml:space="preserve">— all 5 endpoints from</w:t>
             </w:r>
             <w:r>
               <w:t xml:space="preserve"> </w:t>
@@ -2102,14 +2828,16 @@
               <w:t xml:space="preserve">dcb.py</w:t>
             </w:r>
             <w:r>
-              <w:t xml:space="preserve"> </w:t>
+              <w:t xml:space="preserve">: demand cost fetch/print/section-print, and OP ticket recording. Endpoint 3 (</w:t>
             </w:r>
             <w:r>
               <w:rPr>
-                <w:iCs/>
-                <w:i/>
+                <w:rStyle w:val="VerbatimChar"/>
               </w:rPr>
-              <w:t xml:space="preserve">(coming next)</w:t>
+              <w:t xml:space="preserve">bulk-op</w:t>
+            </w:r>
+            <w:r>
+              <w:t xml:space="preserve">) currently cannot succeed — see the doc</w:t>
             </w:r>
           </w:p>
         </w:tc>
@@ -2135,7 +2863,23 @@
               <w:jc w:val="left"/>
             </w:pPr>
             <w:r>
-              <w:t xml:space="preserve">Answer-sheet bundle counts by exam code / programme type / group / scheme / examination — from</w:t>
+              <w:t xml:space="preserve">✅</w:t>
+            </w:r>
+            <w:r>
+              <w:t xml:space="preserve"> </w:t>
+            </w:r>
+            <w:r>
+              <w:rPr>
+                <w:bCs/>
+                <w:b/>
+              </w:rPr>
+              <w:t xml:space="preserve">Complete</w:t>
+            </w:r>
+            <w:r>
+              <w:t xml:space="preserve"> </w:t>
+            </w:r>
+            <w:r>
+              <w:t xml:space="preserve">— all 5 endpoints from</w:t>
             </w:r>
             <w:r>
               <w:t xml:space="preserve"> </w:t>
@@ -2147,14 +2891,7 @@
               <w:t xml:space="preserve">answercount.py</w:t>
             </w:r>
             <w:r>
-              <w:t xml:space="preserve"> </w:t>
-            </w:r>
-            <w:r>
-              <w:rPr>
-                <w:iCs/>
-                <w:i/>
-              </w:rPr>
-              <w:t xml:space="preserve">(coming next)</w:t>
+              <w:t xml:space="preserve">: cascading programme type/group/scheme/exam lookups and the final bundle-count-by-exam-code endpoint</w:t>
             </w:r>
           </w:p>
         </w:tc>
@@ -2180,7 +2917,23 @@
               <w:jc w:val="left"/>
             </w:pPr>
             <w:r>
-              <w:t xml:space="preserve">Student re-admission, semester/paper cancellation, semester registration, CA mark entry &amp; fetch — from</w:t>
+              <w:t xml:space="preserve">✅</w:t>
+            </w:r>
+            <w:r>
+              <w:t xml:space="preserve"> </w:t>
+            </w:r>
+            <w:r>
+              <w:rPr>
+                <w:bCs/>
+                <w:b/>
+              </w:rPr>
+              <w:t xml:space="preserve">Complete</w:t>
+            </w:r>
+            <w:r>
+              <w:t xml:space="preserve"> </w:t>
+            </w:r>
+            <w:r>
+              <w:t xml:space="preserve">— all 13 endpoints from</w:t>
             </w:r>
             <w:r>
               <w:t xml:space="preserve"> </w:t>
@@ -2192,14 +2945,23 @@
               <w:t xml:space="preserve">readmission.py</w:t>
             </w:r>
             <w:r>
+              <w:t xml:space="preserve">: student re-admission (with/without scheme change), semester/paper cancellation, semester registration, and CA mark entry.</w:t>
+            </w:r>
+            <w:r>
               <w:t xml:space="preserve"> </w:t>
             </w:r>
             <w:r>
               <w:rPr>
-                <w:iCs/>
-                <w:i/>
+                <w:bCs/>
+                <w:b/>
               </w:rPr>
-              <w:t xml:space="preserve">(coming next)</w:t>
+              <w:t xml:space="preserve">7 of 13 endpoints silently swallow exceptions and always report success</w:t>
+            </w:r>
+            <w:r>
+              <w:t xml:space="preserve"> </w:t>
+            </w:r>
+            <w:r>
+              <w:t xml:space="preserve">— see the doc’s opening notes</w:t>
             </w:r>
           </w:p>
         </w:tc>
@@ -2225,16 +2987,23 @@
               <w:jc w:val="left"/>
             </w:pPr>
             <w:r>
+              <w:t xml:space="preserve">✅</w:t>
+            </w:r>
+            <w:r>
+              <w:t xml:space="preserve"> </w:t>
+            </w:r>
+            <w:r>
               <w:rPr>
-                <w:rStyle w:val="VerbatimChar"/>
+                <w:bCs/>
+                <w:b/>
               </w:rPr>
-              <w:t xml:space="preserve">StudentMapping</w:t>
-            </w:r>
-            <w:r>
-              <w:t xml:space="preserve"> </w:t>
-            </w:r>
-            <w:r>
-              <w:t xml:space="preserve">view defined in</w:t>
+              <w:t xml:space="preserve">Complete</w:t>
+            </w:r>
+            <w:r>
+              <w:t xml:space="preserve"> </w:t>
+            </w:r>
+            <w:r>
+              <w:t xml:space="preserve">—</w:t>
             </w:r>
             <w:r>
               <w:t xml:space="preserve"> </w:t>
@@ -2246,7 +3015,7 @@
               <w:t xml:space="preserve">student_mapping.py</w:t>
             </w:r>
             <w:r>
-              <w:t xml:space="preserve">, imported in</w:t>
+              <w:t xml:space="preserve">’s one view,</w:t>
             </w:r>
             <w:r>
               <w:t xml:space="preserve"> </w:t>
@@ -2255,13 +3024,10 @@
               <w:rPr>
                 <w:rStyle w:val="VerbatimChar"/>
               </w:rPr>
-              <w:t xml:space="preserve">urls.py</w:t>
-            </w:r>
-            <w:r>
-              <w:t xml:space="preserve"> </w:t>
-            </w:r>
-            <w:r>
-              <w:t xml:space="preserve">but</w:t>
+              <w:t xml:space="preserve">StudentMapping.get</w:t>
+            </w:r>
+            <w:r>
+              <w:t xml:space="preserve">, documented for completeness.</w:t>
             </w:r>
             <w:r>
               <w:t xml:space="preserve"> </w:t>
@@ -2271,13 +3037,13 @@
                 <w:bCs/>
                 <w:b/>
               </w:rPr>
-              <w:t xml:space="preserve">not currently wired to any URL pattern</w:t>
-            </w:r>
-            <w:r>
-              <w:t xml:space="preserve"> </w:t>
-            </w:r>
-            <w:r>
-              <w:t xml:space="preserve">— flagged for confirmation before documenting</w:t>
+              <w:t xml:space="preserve">Not currently wired to any URL</w:t>
+            </w:r>
+            <w:r>
+              <w:t xml:space="preserve"> </w:t>
+            </w:r>
+            <w:r>
+              <w:t xml:space="preserve">— flagged clearly, not a live endpoint</w:t>
             </w:r>
           </w:p>
         </w:tc>
@@ -2288,35 +3054,80 @@
         <w:pStyle w:val="BodyText"/>
       </w:pPr>
       <w:r>
-        <w:t xml:space="preserve">This is a living document — sub-areas are being documented one at a</w:t>
-      </w:r>
-      <w:r>
-        <w:t xml:space="preserve"> </w:t>
-      </w:r>
-      <w:r>
-        <w:t xml:space="preserve">time, in the order they appear in</w:t>
-      </w:r>
-      <w:r>
-        <w:t xml:space="preserve"> </w:t>
-      </w:r>
-      <w:r>
-        <w:rPr>
-          <w:rStyle w:val="VerbatimChar"/>
-        </w:rPr>
-        <w:t xml:space="preserve">academic/urls.py</w:t>
-      </w:r>
-      <w:r>
-        <w:t xml:space="preserve">, and reviewed before</w:t>
-      </w:r>
-      <w:r>
-        <w:t xml:space="preserve"> </w:t>
-      </w:r>
-      <w:r>
-        <w:t xml:space="preserve">moving to the next.</w:t>
+        <w:t xml:space="preserve">All 16 sub-areas are now documented. This file will still get updated</w:t>
+      </w:r>
+      <w:r>
+        <w:t xml:space="preserve"> </w:t>
+      </w:r>
+      <w:r>
+        <w:t xml:space="preserve">if the</w:t>
+      </w:r>
+      <w:r>
+        <w:t xml:space="preserve"> </w:t>
+      </w:r>
+      <w:r>
+        <w:rPr>
+          <w:rStyle w:val="VerbatimChar"/>
+        </w:rPr>
+        <w:t xml:space="preserve">academic</w:t>
+      </w:r>
+      <w:r>
+        <w:t xml:space="preserve"> </w:t>
+      </w:r>
+      <w:r>
+        <w:t xml:space="preserve">app changes, or if any of the flagged gaps (mainly</w:t>
+      </w:r>
+      <w:r>
+        <w:t xml:space="preserve"> </w:t>
+      </w:r>
+      <w:r>
+        <w:rPr>
+          <w:rStyle w:val="VerbatimChar"/>
+        </w:rPr>
+        <w:t xml:space="preserve">util/models.py</w:t>
+      </w:r>
+      <w:r>
+        <w:t xml:space="preserve">,</w:t>
+      </w:r>
+      <w:r>
+        <w:t xml:space="preserve"> </w:t>
+      </w:r>
+      <w:r>
+        <w:rPr>
+          <w:rStyle w:val="VerbatimChar"/>
+        </w:rPr>
+        <w:t xml:space="preserve">util/serializers.py</w:t>
+      </w:r>
+      <w:r>
+        <w:t xml:space="preserve">, and</w:t>
+      </w:r>
+      <w:r>
+        <w:t xml:space="preserve"> </w:t>
+      </w:r>
+      <w:r>
+        <w:rPr>
+          <w:rStyle w:val="VerbatimChar"/>
+        </w:rPr>
+        <w:t xml:space="preserve">util/constants.py</w:t>
+      </w:r>
+      <w:r>
+        <w:t xml:space="preserve">) get</w:t>
+      </w:r>
+      <w:r>
+        <w:t xml:space="preserve"> </w:t>
+      </w:r>
+      <w:r>
+        <w:t xml:space="preserve">filled in with more source to confirm the remaining external field</w:t>
+      </w:r>
+      <w:r>
+        <w:t xml:space="preserve"> </w:t>
+      </w:r>
+      <w:r>
+        <w:t xml:space="preserve">lists.</w:t>
       </w:r>
     </w:p>
-    <w:bookmarkEnd w:id="24"/>
     <w:bookmarkEnd w:id="25"/>
+    <w:bookmarkEnd w:id="26"/>
     <w:sectPr/>
   </w:body>
 </w:document>
@@ -2499,6 +3310,91 @@
       </w:pPr>
     </w:lvl>
   </w:abstractNum>
+  <w:abstractNum w:abstractNumId="99411">
+    <w:nsid w:val="A99411"/>
+    <w:multiLevelType w:val="multilevel"/>
+    <w:lvl w:ilvl="0">
+      <w:start w:val="1"/>
+      <w:numFmt w:val="decimal"/>
+      <w:lvlText w:val="%1."/>
+      <w:lvlJc w:val="left"/>
+      <w:pPr>
+        <w:ind w:left="720" w:hanging="480"/>
+      </w:pPr>
+    </w:lvl>
+    <w:lvl w:ilvl="1">
+      <w:start w:val="1"/>
+      <w:numFmt w:val="decimal"/>
+      <w:lvlText w:val="%2."/>
+      <w:lvlJc w:val="left"/>
+      <w:pPr>
+        <w:ind w:left="1440" w:hanging="480"/>
+      </w:pPr>
+    </w:lvl>
+    <w:lvl w:ilvl="2">
+      <w:start w:val="1"/>
+      <w:numFmt w:val="decimal"/>
+      <w:lvlText w:val="%3."/>
+      <w:lvlJc w:val="left"/>
+      <w:pPr>
+        <w:ind w:left="2160" w:hanging="480"/>
+      </w:pPr>
+    </w:lvl>
+    <w:lvl w:ilvl="3">
+      <w:start w:val="1"/>
+      <w:numFmt w:val="decimal"/>
+      <w:lvlText w:val="%4."/>
+      <w:lvlJc w:val="left"/>
+      <w:pPr>
+        <w:ind w:left="2880" w:hanging="480"/>
+      </w:pPr>
+    </w:lvl>
+    <w:lvl w:ilvl="4">
+      <w:start w:val="1"/>
+      <w:numFmt w:val="decimal"/>
+      <w:lvlText w:val="%5."/>
+      <w:lvlJc w:val="left"/>
+      <w:pPr>
+        <w:ind w:left="3600" w:hanging="480"/>
+      </w:pPr>
+    </w:lvl>
+    <w:lvl w:ilvl="5">
+      <w:start w:val="1"/>
+      <w:numFmt w:val="decimal"/>
+      <w:lvlText w:val="%6."/>
+      <w:lvlJc w:val="left"/>
+      <w:pPr>
+        <w:ind w:left="4320" w:hanging="480"/>
+      </w:pPr>
+    </w:lvl>
+    <w:lvl w:ilvl="6">
+      <w:start w:val="1"/>
+      <w:numFmt w:val="decimal"/>
+      <w:lvlText w:val="%7."/>
+      <w:lvlJc w:val="left"/>
+      <w:pPr>
+        <w:ind w:left="5040" w:hanging="480"/>
+      </w:pPr>
+    </w:lvl>
+    <w:lvl w:ilvl="7">
+      <w:start w:val="1"/>
+      <w:numFmt w:val="decimal"/>
+      <w:lvlText w:val="%8."/>
+      <w:lvlJc w:val="left"/>
+      <w:pPr>
+        <w:ind w:left="5760" w:hanging="480"/>
+      </w:pPr>
+    </w:lvl>
+    <w:lvl w:ilvl="8">
+      <w:start w:val="1"/>
+      <w:numFmt w:val="decimal"/>
+      <w:lvlText w:val="%9."/>
+      <w:lvlJc w:val="left"/>
+      <w:pPr>
+        <w:ind w:left="6480" w:hanging="480"/>
+      </w:pPr>
+    </w:lvl>
+  </w:abstractNum>
   <w:num w:numId="1000">
     <w:abstractNumId w:val="990"/>
   </w:num>
@@ -2506,6 +3402,36 @@
     <w:abstractNumId w:val="991"/>
   </w:num>
   <w:num w:numId="1002">
+    <w:abstractNumId w:val="99411"/>
+    <w:lvlOverride w:ilvl="0">
+      <w:startOverride w:val="1"/>
+    </w:lvlOverride>
+    <w:lvlOverride w:ilvl="1">
+      <w:startOverride w:val="1"/>
+    </w:lvlOverride>
+    <w:lvlOverride w:ilvl="2">
+      <w:startOverride w:val="1"/>
+    </w:lvlOverride>
+    <w:lvlOverride w:ilvl="3">
+      <w:startOverride w:val="1"/>
+    </w:lvlOverride>
+    <w:lvlOverride w:ilvl="4">
+      <w:startOverride w:val="1"/>
+    </w:lvlOverride>
+    <w:lvlOverride w:ilvl="5">
+      <w:startOverride w:val="1"/>
+    </w:lvlOverride>
+    <w:lvlOverride w:ilvl="6">
+      <w:startOverride w:val="1"/>
+    </w:lvlOverride>
+    <w:lvlOverride w:ilvl="7">
+      <w:startOverride w:val="1"/>
+    </w:lvlOverride>
+    <w:lvlOverride w:ilvl="8">
+      <w:startOverride w:val="1"/>
+    </w:lvlOverride>
+  </w:num>
+  <w:num w:numId="1003">
     <w:abstractNumId w:val="991"/>
   </w:num>
 </w:numbering>

</xml_diff>